<commit_message>
ppx and mfile additions for affine3D_img tutorial
</commit_message>
<xml_diff>
--- a/Documentation/Tutorials/ReadMe_NeuroDOT_Tutorials.docx
+++ b/Documentation/Tutorials/ReadMe_NeuroDOT_Tutorials.docx
@@ -221,9 +221,14 @@
         <w:t xml:space="preserve">) </w:t>
       </w:r>
     </w:p>
-    <w:p/>
-    <w:p/>
-    <w:p/>
+    <w:p>
+      <w:pPr>
+        <w:numPr>
+          <w:ilvl w:val="0"/>
+          <w:numId w:val="11"/>
+        </w:numPr>
+      </w:pPr>
+    </w:p>
     <w:p>
       <w:pPr>
         <w:rPr>
@@ -720,6 +725,107 @@
         <w:t>NeuroDOT_Visualization_Script</w:t>
       </w:r>
       <w:proofErr w:type="spellEnd"/>
+    </w:p>
+    <w:p>
+      <w:pPr>
+        <w:pStyle w:val="ListParagraph"/>
+        <w:numPr>
+          <w:ilvl w:val="0"/>
+          <w:numId w:val="9"/>
+        </w:numPr>
+        <w:rPr>
+          <w:rFonts w:cstheme="minorHAnsi"/>
+          <w:sz w:val="24"/>
+          <w:szCs w:val="24"/>
+        </w:rPr>
+      </w:pPr>
+      <w:r>
+        <w:rPr>
+          <w:rFonts w:cstheme="minorHAnsi"/>
+          <w:sz w:val="24"/>
+          <w:szCs w:val="24"/>
+        </w:rPr>
+        <w:t>Spatial Transformations using affine3D_img</w:t>
+      </w:r>
+    </w:p>
+    <w:p>
+      <w:pPr>
+        <w:pStyle w:val="ListParagraph"/>
+        <w:numPr>
+          <w:ilvl w:val="1"/>
+          <w:numId w:val="9"/>
+        </w:numPr>
+        <w:rPr>
+          <w:rFonts w:cstheme="minorHAnsi"/>
+          <w:szCs w:val="24"/>
+        </w:rPr>
+      </w:pPr>
+      <w:r>
+        <w:rPr>
+          <w:rFonts w:cstheme="minorHAnsi"/>
+          <w:b/>
+          <w:szCs w:val="24"/>
+        </w:rPr>
+        <w:t>PPT:</w:t>
+      </w:r>
+      <w:r>
+        <w:rPr>
+          <w:rFonts w:cstheme="minorHAnsi"/>
+          <w:szCs w:val="24"/>
+        </w:rPr>
+        <w:t xml:space="preserve"> </w:t>
+      </w:r>
+      <w:proofErr w:type="spellStart"/>
+      <w:r>
+        <w:rPr>
+          <w:rFonts w:cstheme="minorHAnsi"/>
+          <w:szCs w:val="24"/>
+        </w:rPr>
+        <w:t>NeuroDOT_Tutorial_</w:t>
+      </w:r>
+      <w:r>
+        <w:rPr>
+          <w:rFonts w:cstheme="minorHAnsi"/>
+          <w:szCs w:val="24"/>
+        </w:rPr>
+        <w:t>Spatial_Transformations</w:t>
+      </w:r>
+      <w:proofErr w:type="spellEnd"/>
+    </w:p>
+    <w:p>
+      <w:pPr>
+        <w:pStyle w:val="ListParagraph"/>
+        <w:numPr>
+          <w:ilvl w:val="1"/>
+          <w:numId w:val="9"/>
+        </w:numPr>
+        <w:rPr>
+          <w:rFonts w:cstheme="minorHAnsi"/>
+          <w:szCs w:val="24"/>
+        </w:rPr>
+      </w:pPr>
+      <w:r>
+        <w:rPr>
+          <w:rFonts w:cstheme="minorHAnsi"/>
+          <w:b/>
+          <w:szCs w:val="24"/>
+        </w:rPr>
+        <w:t>Script:</w:t>
+      </w:r>
+      <w:r>
+        <w:rPr>
+          <w:rFonts w:cstheme="minorHAnsi"/>
+          <w:szCs w:val="24"/>
+        </w:rPr>
+        <w:t xml:space="preserve"> </w:t>
+      </w:r>
+      <w:r>
+        <w:rPr>
+          <w:rFonts w:cstheme="minorHAnsi"/>
+          <w:szCs w:val="24"/>
+        </w:rPr>
+        <w:t>NeuroDOT_Tutorial_Spatial_Transformations</w:t>
+      </w:r>
     </w:p>
     <w:p>
       <w:pPr>
@@ -4024,6 +4130,7 @@
   <w:style w:type="character" w:default="1" w:styleId="DefaultParagraphFont">
     <w:name w:val="Default Paragraph Font"/>
     <w:uiPriority w:val="1"/>
+    <w:semiHidden/>
     <w:unhideWhenUsed/>
   </w:style>
   <w:style w:type="table" w:default="1" w:styleId="TableNormal">

</xml_diff>